<commit_message>
Se agregan imagenes al readme
</commit_message>
<xml_diff>
--- a/corte_3/laboratorio_circuit_breaker/Laboratorio Sistema que aprende a fallar - Jose99Mir.docx
+++ b/corte_3/laboratorio_circuit_breaker/Laboratorio Sistema que aprende a fallar - Jose99Mir.docx
@@ -1358,7 +1358,6 @@
         <w:jc w:val="both"/>
         <w:rPr>
           <w:rFonts w:ascii="Times New Roman" w:hAnsi="Times New Roman" w:cs="Times New Roman"/>
-          <w:lang w:eastAsia="es-MX"/>
         </w:rPr>
       </w:pPr>
       <w:r>
@@ -1482,12 +1481,22 @@
           <w:lang w:eastAsia="es-MX"/>
         </w:rPr>
       </w:pPr>
+    </w:p>
+    <w:p>
+      <w:pPr>
+        <w:jc w:val="both"/>
+        <w:rPr>
+          <w:rFonts w:ascii="Times New Roman" w:hAnsi="Times New Roman" w:cs="Times New Roman"/>
+          <w:lang w:eastAsia="es-MX"/>
+        </w:rPr>
+      </w:pPr>
       <w:r>
         <w:rPr>
           <w:rFonts w:ascii="Times New Roman" w:hAnsi="Times New Roman" w:cs="Times New Roman"/>
           <w:noProof/>
           <w:lang w:eastAsia="es-MX"/>
         </w:rPr>
+        <w:lastRenderedPageBreak/>
         <w:drawing>
           <wp:inline distT="0" distB="0" distL="0" distR="0" wp14:anchorId="0E3F955D" wp14:editId="497131D5">
             <wp:extent cx="5612130" cy="1440180"/>
@@ -1537,29 +1546,20 @@
           <w:rFonts w:ascii="Times New Roman" w:hAnsi="Times New Roman" w:cs="Times New Roman"/>
           <w:lang w:eastAsia="es-MX"/>
         </w:rPr>
-        <w:lastRenderedPageBreak/>
-        <w:t xml:space="preserve">Implementación en servicio de </w:t>
-      </w:r>
-      <w:proofErr w:type="spellStart"/>
-      <w:r>
-        <w:rPr>
-          <w:rFonts w:ascii="Times New Roman" w:hAnsi="Times New Roman" w:cs="Times New Roman"/>
-          <w:lang w:eastAsia="es-MX"/>
-        </w:rPr>
-        <w:t>usuarios</w:t>
-      </w:r>
-      <w:r>
-        <w:rPr>
-          <w:rFonts w:ascii="Times New Roman" w:hAnsi="Times New Roman" w:cs="Times New Roman"/>
-        </w:rPr>
-        <w:t>con</w:t>
-      </w:r>
-      <w:proofErr w:type="spellEnd"/>
-      <w:r>
-        <w:rPr>
-          <w:rFonts w:ascii="Times New Roman" w:hAnsi="Times New Roman" w:cs="Times New Roman"/>
+        <w:t>Implementación en servicio de usuarios</w:t>
+      </w:r>
+      <w:r>
+        <w:rPr>
+          <w:rFonts w:ascii="Times New Roman" w:hAnsi="Times New Roman" w:cs="Times New Roman"/>
+          <w:lang w:eastAsia="es-MX"/>
         </w:rPr>
         <w:t xml:space="preserve"> </w:t>
+      </w:r>
+      <w:r>
+        <w:rPr>
+          <w:rFonts w:ascii="Times New Roman" w:hAnsi="Times New Roman" w:cs="Times New Roman"/>
+        </w:rPr>
+        <w:t xml:space="preserve">con </w:t>
       </w:r>
       <w:proofErr w:type="spellStart"/>
       <w:r>
@@ -1675,6 +1675,98 @@
     </w:p>
     <w:p>
       <w:pPr>
+        <w:tabs>
+          <w:tab w:val="left" w:pos="7037"/>
+        </w:tabs>
+        <w:rPr>
+          <w:rFonts w:ascii="Times New Roman" w:hAnsi="Times New Roman" w:cs="Times New Roman"/>
+        </w:rPr>
+      </w:pPr>
+      <w:r>
+        <w:rPr>
+          <w:rFonts w:ascii="Times New Roman" w:hAnsi="Times New Roman" w:cs="Times New Roman"/>
+        </w:rPr>
+        <w:tab/>
+      </w:r>
+    </w:p>
+    <w:p>
+      <w:pPr>
+        <w:jc w:val="both"/>
+        <w:rPr>
+          <w:rFonts w:ascii="Times New Roman" w:hAnsi="Times New Roman" w:cs="Times New Roman"/>
+        </w:rPr>
+      </w:pPr>
+      <w:r>
+        <w:rPr>
+          <w:rFonts w:ascii="Times New Roman" w:hAnsi="Times New Roman" w:cs="Times New Roman"/>
+          <w:noProof/>
+        </w:rPr>
+        <w:drawing>
+          <wp:inline distT="0" distB="0" distL="0" distR="0" wp14:anchorId="48232088" wp14:editId="06A3D482">
+            <wp:extent cx="5612130" cy="1444625"/>
+            <wp:effectExtent l="0" t="0" r="1270" b="3175"/>
+            <wp:docPr id="1853286155" name="Imagen 1"/>
+            <wp:cNvGraphicFramePr>
+              <a:graphicFrameLocks xmlns:a="http://schemas.openxmlformats.org/drawingml/2006/main" noChangeAspect="1"/>
+            </wp:cNvGraphicFramePr>
+            <a:graphic xmlns:a="http://schemas.openxmlformats.org/drawingml/2006/main">
+              <a:graphicData uri="http://schemas.openxmlformats.org/drawingml/2006/picture">
+                <pic:pic xmlns:pic="http://schemas.openxmlformats.org/drawingml/2006/picture">
+                  <pic:nvPicPr>
+                    <pic:cNvPr id="1853286155" name=""/>
+                    <pic:cNvPicPr/>
+                  </pic:nvPicPr>
+                  <pic:blipFill>
+                    <a:blip r:embed="rId10"/>
+                    <a:stretch>
+                      <a:fillRect/>
+                    </a:stretch>
+                  </pic:blipFill>
+                  <pic:spPr>
+                    <a:xfrm>
+                      <a:off x="0" y="0"/>
+                      <a:ext cx="5612130" cy="1444625"/>
+                    </a:xfrm>
+                    <a:prstGeom prst="rect">
+                      <a:avLst/>
+                    </a:prstGeom>
+                  </pic:spPr>
+                </pic:pic>
+              </a:graphicData>
+            </a:graphic>
+          </wp:inline>
+        </w:drawing>
+      </w:r>
+    </w:p>
+    <w:p>
+      <w:pPr>
+        <w:jc w:val="both"/>
+        <w:rPr>
+          <w:rFonts w:ascii="Times New Roman" w:hAnsi="Times New Roman" w:cs="Times New Roman"/>
+        </w:rPr>
+      </w:pPr>
+      <w:r>
+        <w:rPr>
+          <w:rFonts w:ascii="Times New Roman" w:hAnsi="Times New Roman" w:cs="Times New Roman"/>
+        </w:rPr>
+        <w:t>Servicio de mascotas funcionando así el servicio de usuarios esté en falla</w:t>
+      </w:r>
+    </w:p>
+    <w:p>
+      <w:pPr>
+        <w:tabs>
+          <w:tab w:val="left" w:pos="7037"/>
+        </w:tabs>
+        <w:rPr>
+          <w:rFonts w:ascii="Times New Roman" w:hAnsi="Times New Roman" w:cs="Times New Roman"/>
+        </w:rPr>
+      </w:pPr>
+    </w:p>
+    <w:p>
+      <w:pPr>
+        <w:tabs>
+          <w:tab w:val="left" w:pos="7037"/>
+        </w:tabs>
         <w:rPr>
           <w:rFonts w:ascii="Times New Roman" w:hAnsi="Times New Roman" w:cs="Times New Roman"/>
           <w:lang w:eastAsia="es-MX"/>
@@ -1687,21 +1779,28 @@
         </w:rPr>
         <w:br w:type="page"/>
       </w:r>
-    </w:p>
-    <w:p>
-      <w:pPr>
-        <w:jc w:val="both"/>
-        <w:rPr>
-          <w:rFonts w:ascii="Times New Roman" w:hAnsi="Times New Roman" w:cs="Times New Roman"/>
-          <w:lang w:eastAsia="es-MX"/>
-        </w:rPr>
-      </w:pPr>
       <w:r>
         <w:rPr>
           <w:rFonts w:ascii="Times New Roman" w:hAnsi="Times New Roman" w:cs="Times New Roman"/>
           <w:lang w:eastAsia="es-MX"/>
         </w:rPr>
         <w:lastRenderedPageBreak/>
+        <w:tab/>
+      </w:r>
+    </w:p>
+    <w:p>
+      <w:pPr>
+        <w:jc w:val="both"/>
+        <w:rPr>
+          <w:rFonts w:ascii="Times New Roman" w:hAnsi="Times New Roman" w:cs="Times New Roman"/>
+          <w:lang w:eastAsia="es-MX"/>
+        </w:rPr>
+      </w:pPr>
+      <w:r>
+        <w:rPr>
+          <w:rFonts w:ascii="Times New Roman" w:hAnsi="Times New Roman" w:cs="Times New Roman"/>
+          <w:lang w:eastAsia="es-MX"/>
+        </w:rPr>
         <w:t>FASE 3 – INVESTIGAR (Half-Open)</w:t>
       </w:r>
     </w:p>
@@ -2064,7 +2163,7 @@
                     <pic:cNvPicPr/>
                   </pic:nvPicPr>
                   <pic:blipFill>
-                    <a:blip r:embed="rId10"/>
+                    <a:blip r:embed="rId11"/>
                     <a:stretch>
                       <a:fillRect/>
                     </a:stretch>
@@ -2265,7 +2364,7 @@
                     <pic:cNvPicPr/>
                   </pic:nvPicPr>
                   <pic:blipFill>
-                    <a:blip r:embed="rId11"/>
+                    <a:blip r:embed="rId12"/>
                     <a:stretch>
                       <a:fillRect/>
                     </a:stretch>
@@ -2345,7 +2444,7 @@
                     <pic:cNvPicPr/>
                   </pic:nvPicPr>
                   <pic:blipFill>
-                    <a:blip r:embed="rId12"/>
+                    <a:blip r:embed="rId13"/>
                     <a:stretch>
                       <a:fillRect/>
                     </a:stretch>
@@ -2408,7 +2507,7 @@
                     <pic:cNvPicPr/>
                   </pic:nvPicPr>
                   <pic:blipFill>
-                    <a:blip r:embed="rId13"/>
+                    <a:blip r:embed="rId14"/>
                     <a:stretch>
                       <a:fillRect/>
                     </a:stretch>
@@ -2584,7 +2683,7 @@
                     <pic:cNvPicPr/>
                   </pic:nvPicPr>
                   <pic:blipFill>
-                    <a:blip r:embed="rId14"/>
+                    <a:blip r:embed="rId15"/>
                     <a:stretch>
                       <a:fillRect/>
                     </a:stretch>
@@ -2653,7 +2752,7 @@
                     <pic:cNvPicPr/>
                   </pic:nvPicPr>
                   <pic:blipFill>
-                    <a:blip r:embed="rId15"/>
+                    <a:blip r:embed="rId16"/>
                     <a:stretch>
                       <a:fillRect/>
                     </a:stretch>
@@ -2716,7 +2815,7 @@
                     <pic:cNvPicPr/>
                   </pic:nvPicPr>
                   <pic:blipFill>
-                    <a:blip r:embed="rId16"/>
+                    <a:blip r:embed="rId17"/>
                     <a:stretch>
                       <a:fillRect/>
                     </a:stretch>
@@ -2794,7 +2893,7 @@
                     <pic:cNvPicPr/>
                   </pic:nvPicPr>
                   <pic:blipFill>
-                    <a:blip r:embed="rId17"/>
+                    <a:blip r:embed="rId18"/>
                     <a:stretch>
                       <a:fillRect/>
                     </a:stretch>
@@ -2865,7 +2964,7 @@
                     <pic:cNvPicPr/>
                   </pic:nvPicPr>
                   <pic:blipFill>
-                    <a:blip r:embed="rId10"/>
+                    <a:blip r:embed="rId11"/>
                     <a:stretch>
                       <a:fillRect/>
                     </a:stretch>

</xml_diff>